<commit_message>
feat(cdp): fecha_cdp en formularios, documentos y valor de imputación
- Agrega fecha_cdp a ContratoUpdate (schema) para poder editarlo
- Pasa fecha_cdp en endpoints DOCX (/numero y /id)
- <<VALOR DEL CDP>> y <<VALOR DE CDP>> ahora usan el valor del contrato
  con formato en letras, no el campo separado valor_cdp
- solicitud_cdp.docx e invitacion.docx usan <<FECHA DEL CDP>> en lugar
  de <<FECHA DEL CONTRATO>>
- Frontend: campo fecha_cdp en nuevo/editar contrato + muestra en detalle
</commit_message>
<xml_diff>
--- a/backend/app/templates/solicitud_cdp.docx
+++ b/backend/app/templates/solicitud_cdp.docx
@@ -168,15 +168,14 @@
                 <w:sz w:val="22"/>
                 <w:szCs w:val="22"/>
               </w:rPr>
-              <w:t xml:space="preserve">Fecha: </w:t>
-            </w:r>
-            <w:r>
-              <w:rPr>
-                <w:rFonts w:ascii="Aptos Display" w:eastAsia="Arial" w:hAnsi="Aptos Display" w:cs="Arial"/>
-                <w:sz w:val="22"/>
-                <w:szCs w:val="22"/>
-              </w:rPr>
-              <w:t>&lt;&lt;FECHA DEL CONTRATO&gt;&gt;</w:t>
+              <w:t>Fecha: &lt;&lt;FECHA DEL CDP&gt;&gt;</w:t>
+            </w:r>
+            <w:r>
+              <w:rPr>
+                <w:rFonts w:ascii="Aptos Display" w:eastAsia="Arial" w:hAnsi="Aptos Display" w:cs="Arial"/>
+                <w:sz w:val="22"/>
+                <w:szCs w:val="22"/>
+              </w:rPr>
             </w:r>
           </w:p>
         </w:tc>

</xml_diff>